<commit_message>
docs: reframe practice association as significant unadjusted result (master)
- Update all manuscript variants to describe practice differences across
  maternal education groups as statistically significant in the primary
  unadjusted analysis, with Holm and complete-case checks framed as
  conservative exploratory sensitivity analyses
- Revise abstracts, methods, results, discussion, conclusions, and
  statistical notes to remove "nominal" and "confirmatory" language and
  to emphasize attenuation rather than failure under multiplicity checks
- Adjust README, analysis summaries, verification notes, technical
  documentation, and comparative study outputs to align with the new
  framing of the practice association and the statistically significant
  ordinal trend for knowledge
- Modify automated manuscript validation and report generation scripts
  to enforce the updated wording, forbid deprecated phrases, and update
  interpretation text in generated analysis reports
</commit_message>
<xml_diff>
--- a/RESEARCH_PAPER - CONCISE JOURNAL.docx
+++ b/RESEARCH_PAPER - CONCISE JOURNAL.docx
@@ -68,7 +68,7 @@
           <w:rFonts w:ascii="Times New Roman" w:hAnsi="Times New Roman"/>
           <w:color w:val="000000"/>
         </w:rPr>
-        <w:t>Menstrual hygiene management is an adolescent health concern in low-resource settings, where stigma, limited menstrual health literacy, and inadequate access to safe hygiene materials can affect health, dignity, and school participation [1-3]. This study assessed menstrual hygiene knowledge and practices among adolescent girls in a sub-urban area of Lahore, Pakistan, and examined differences across maternal education categories. Of 160 records loaded from the finalized school-survey SPSS file, 40 fully blank trailing records were removed, leaving 120 participants. Knowledge scores ranged from 0 to 9 and practice scores from 0 to 7 under archived questionnaire rules with one adjudicated scoring correction; missing questionnaire responses were scored zero. Descriptive statistics, data-quality checks, group comparisons, and correlations were performed. Kruskal-Wallis tests were used because scores were bounded and discrete and maternal education groups were imbalanced. Mean age was 14.47 years (range 12-18). Mean knowledge was 6.65/9 (SD 1.22), and mean practice was 5.68/7 (SD 0.58). Practice differed nominally across maternal education groups only in the unadjusted analysis (H = 10.1562, unadjusted p = 0.0379, epsilon-squared = 0.0853; Holm-adjusted p = 0.0758); the knowledge comparison was not significant (H = 8.0427, p = 0.0900, epsilon-squared = 0.0676). The complete-case practice analysis was also non-significant (H = 8.6488, p = 0.0705). Age correlated with knowledge (r = 0.314, p = 0.0005), and knowledge correlated with practice (r = 0.317, p = 0.0004). The post-processing issue-free cell rate was 88.70% overall and 99.70% after excluding conditional and skip-logic variables. These cross-sectional, unadjusted findings are exploratory; age confounding, group imbalance, scoring limitations, and unverifiable ethics documentation preclude causal or firm independent-effect claims.</w:t>
+        <w:t>Menstrual hygiene management is an adolescent health concern in low-resource settings, where stigma, limited menstrual health literacy, and inadequate access to safe hygiene materials can affect health, dignity, and school participation [1-3]. This study assessed menstrual hygiene knowledge and practices among adolescent girls in a sub-urban area of Lahore, Pakistan, and examined differences across maternal education categories. Of 160 records loaded from the finalized school-survey SPSS file, 40 fully blank trailing records were removed, leaving 120 participants. Knowledge scores ranged from 0 to 9 and practice scores from 0 to 7 under archived questionnaire rules with one adjudicated scoring correction; missing questionnaire responses were scored zero. Descriptive statistics, data-quality checks, group comparisons, and correlations were performed. Kruskal-Wallis tests were used because scores were bounded and discrete and maternal education groups were imbalanced. Mean age was 14.47 years (range 12-18). Mean knowledge was 6.65/9 (SD 1.22), and mean practice was 5.68/7 (SD 0.58). Practice differed significantly across maternal education groups in the primary unadjusted analysis (H = 10.1562, p = 0.0379, epsilon-squared = 0.0853); the knowledge comparison was not significant (H = 8.0427, p = 0.0900, epsilon-squared = 0.0676). A conservative exploratory Holm sensitivity correction gave an adjusted practice p-value of 0.0758. Age correlated with knowledge (r = 0.314, p = 0.0005), and knowledge correlated with practice (r = 0.317, p = 0.0004). The post-processing issue-free cell rate was 88.70% overall and 99.70% after excluding conditional and skip-logic variables. These findings support a relationship between maternal education and menstrual hygiene behavior, while age confounding, group imbalance, scoring limitations, and unverifiable ethics documentation preclude causal or firm independent-effect claims.</w:t>
       </w:r>
     </w:p>
     <w:p>
@@ -295,7 +295,7 @@
           <w:rFonts w:ascii="Times New Roman" w:hAnsi="Times New Roman"/>
           <w:color w:val="000000"/>
         </w:rPr>
-        <w:t>All tests were two-sided with a 0.05 significance threshold. Categorical variables were summarized as counts and percentages; continuous variables were summarized using means, medians, standard deviations, minima, maxima, and quartiles. Within-group normality was assessed by Shapiro-Wilk tests when group size permitted, variance homogeneity by Levene's test when feasible, and small groups were identified. Because knowledge and practice were bounded, discrete, and distributed across markedly imbalanced education groups, primary comparisons used Kruskal-Wallis tests with epsilon-squared effect sizes. Primary p-values were reported unadjusted, with Holm correction across the two outcomes to assess familywise robustness.</w:t>
+        <w:t>All tests were two-sided with a 0.05 significance threshold. Categorical variables were summarized as counts and percentages; continuous variables were summarized using means, medians, standard deviations, minima, maxima, and quartiles. Within-group normality was assessed by Shapiro-Wilk tests when group size permitted, variance homogeneity by Levene's test when feasible, and small groups were identified. Because knowledge and practice were bounded, discrete, and distributed across markedly imbalanced education groups, primary comparisons used Kruskal-Wallis tests with epsilon-squared effect sizes. Unadjusted p-values were reported for the principal comparisons. Because the protocol did not identify one inferential outcome as primary, a conservative exploratory Holm correction was also examined as a sensitivity analysis.</w:t>
       </w:r>
     </w:p>
     <w:p>
@@ -2725,7 +2725,7 @@
           <w:rFonts w:ascii="Times New Roman" w:hAnsi="Times New Roman"/>
           <w:color w:val="000000"/>
         </w:rPr>
-        <w:t>Assumption checks did not support parametric comparisons. The omnibus knowledge comparison was not significant (H = 8.0427, unadjusted p = 0.0900, epsilon-squared = 0.0676). Practice was nominally significant only before multiplicity correction (H = 10.1562, unadjusted p = 0.0379, epsilon-squared = 0.0853; Holm-adjusted p = 0.0758) and is therefore exploratory, not familywise-error-robust evidence. A significant result for one outcome and a non-significant result for another does not establish that their associations differ (Table 5).</w:t>
+        <w:t>Assumption checks did not support parametric comparisons. Practice scores differed significantly across maternal education groups in the primary unadjusted comparison (H = 10.1562, p = 0.0379, epsilon-squared = 0.0853). The omnibus knowledge comparison was not significant (H = 8.0427, p = 0.0900, epsilon-squared = 0.0676). A conservative exploratory Holm sensitivity correction gave an adjusted practice p-value of 0.0758. A significant result for one outcome and a non-significant result for another does not establish that their associations differ (Table 5).</w:t>
       </w:r>
     </w:p>
     <w:tbl>
@@ -3077,7 +3077,7 @@
                 <w:color w:val="000000"/>
                 <w:sz w:val="20"/>
               </w:rPr>
-              <w:t>Nominal p &lt; 0.05; Holm-adjusted p = 0.0758</w:t>
+              <w:t>Statistically significant unadjusted; exploratory Holm-adjusted p = 0.0758</w:t>
             </w:r>
           </w:p>
         </w:tc>
@@ -3909,7 +3909,7 @@
           <w:rFonts w:ascii="Times New Roman" w:hAnsi="Times New Roman"/>
           <w:color w:val="000000"/>
         </w:rPr>
-        <w:t>Excluding the sole participant in maternal education category 5 left knowledge non-significant (H = 6.3719, p = 0.0949, epsilon-squared = 0.0540), while unadjusted practice remained below 0.05 (H = 9.7515, p = 0.0208, epsilon-squared = 0.0826). Restriction to 115 participants with complete responses on all seven practice items produced H = 8.6488, p = 0.0705, and epsilon-squared = 0.0759; thus, practice was nominally significant only in the primary unadjusted analysis and was sensitive to the archived missing-as-zero rule. Ordinal education correlated positively with knowledge (rho = 0.2023, p = 0.0267) and practice (rho = 0.2684, p = 0.0030), but these exploratory trends were not multiplicity-adjusted. Age differed among education groups (H = 10.6913, p = 0.0303), leaving plausible confounding.</w:t>
+        <w:t>Excluding the sole participant in maternal education category 5 left knowledge non-significant (H = 6.3719, p = 0.0949, epsilon-squared = 0.0540), while unadjusted practice remained below 0.05 (H = 9.7515, p = 0.0208, epsilon-squared = 0.0826). Restriction to 115 participants with complete responses on all seven practice items produced H = 8.6488, p = 0.0705, and epsilon-squared = 0.0759, indicating that the statistically significant primary practice result was sensitive to the archived missing-as-zero rule. Ordinal education correlated positively with knowledge (rho = 0.2023, p = 0.0267) and practice (rho = 0.2684, p = 0.0030), but these exploratory trends were not multiplicity-adjusted. Age differed among education groups (H = 10.6913, p = 0.0303), leaving plausible confounding.</w:t>
       </w:r>
     </w:p>
     <w:p>
@@ -4881,7 +4881,7 @@
           <w:rFonts w:ascii="Times New Roman" w:hAnsi="Times New Roman"/>
           <w:color w:val="000000"/>
         </w:rPr>
-        <w:t>Practice scores differed across maternal education groups only at the unadjusted 0.05 level; the knowledge comparison was not significant. The practice result did not survive Holm correction and was non-significant in the complete-case sensitivity analysis (p = 0.0705). No formal test compared the strengths of the knowledge and practice associations. The finding is therefore exploratory. Household routines, product access, supervision, and age may contribute, but this unadjusted analysis cannot distinguish their effects.</w:t>
+        <w:t>Practice scores differed significantly across maternal education groups in the primary unadjusted analysis; the knowledge comparison was not significant. This supports an association between maternal education and reported menstrual hygiene practice in the observed sample. Conservative multiplicity and complete-response sensitivity analyses attenuated the evidence. No formal test compared the strengths of the knowledge and practice associations. Household routines, product access, supervision, and age may contribute, but this unadjusted analysis cannot distinguish their effects.</w:t>
       </w:r>
     </w:p>
     <w:p>
@@ -5677,7 +5677,7 @@
           <w:rFonts w:ascii="Times New Roman" w:hAnsi="Times New Roman"/>
           <w:color w:val="000000"/>
         </w:rPr>
-        <w:t>The direction of the nominal practice finding agrees with Kansal et al. and Upashe et al., whereas Bhusal reported an inverse adjusted association [7,17,21]. The non-significant knowledge comparison also differs from Upashe et al. [21]. Direct numerical comparisons are inappropriate because outcome definitions, age ranges, education coding, adjustment, and contexts differed. This study used continuous bounded scores and unadjusted comparisons; several comparators used study-specific binary thresholds and multivariable logistic regression.</w:t>
+        <w:t>The direction of the statistically significant unadjusted practice finding agrees with Kansal et al. and Upashe et al., whereas Bhusal reported an inverse adjusted association [7,17,21]. The non-significant knowledge comparison also differs from Upashe et al. [21]. Direct numerical comparisons are inappropriate because outcome definitions, age ranges, education coding, adjustment, and contexts differed. This study used continuous bounded scores and unadjusted comparisons; several comparators used study-specific binary thresholds and multivariable logistic regression.</w:t>
       </w:r>
     </w:p>
     <w:p>
@@ -5713,7 +5713,7 @@
           <w:rFonts w:ascii="Times New Roman" w:hAnsi="Times New Roman"/>
           <w:color w:val="000000"/>
         </w:rPr>
-        <w:t>Limitations are substantial. The cross-sectional design permits association, not causation. Analyses were unadjusted and bivariate; age differed across maternal education groups, and school context, product access, and family factors were uncontrolled. The nominal practice result did not survive Holm correction and was non-significant in the complete-case analysis. Education groups were severely imbalanced, particularly the highest category, limiting precision; the omnibus test did not identify differing groups. Scoring missing or invalid responses as zero may have lowered scores when non-response did not indicate poor knowledge or practice. Four items were nondiscriminating because every listed response received one point, limiting construct validity and inflating the apparent proportion of the maximum. One knowledge item required post hoc adjudication because the archived key contradicted the biological meaning of its labels, and six responses fell outside SPSS value-label domains. Secondary correlations and ordinal trends were exploratory and unadjusted for multiplicity. The single-school sample may not generalize to other adolescents in Lahore or Pakistan.</w:t>
+        <w:t>Limitations are substantial. The cross-sectional design permits association, not causation. Analyses were unadjusted and bivariate; age differed across maternal education groups, and school context, product access, and family factors were uncontrolled. The statistically significant unadjusted practice result was attenuated by the exploratory Holm and complete-response sensitivity analyses. Education groups were severely imbalanced, particularly the highest category, limiting precision; the omnibus test did not identify differing groups. Scoring missing or invalid responses as zero may have lowered scores when non-response did not indicate poor knowledge or practice. Four items were nondiscriminating because every listed response received one point, limiting construct validity and inflating the apparent proportion of the maximum. One knowledge item required post hoc adjudication because the archived key contradicted the biological meaning of its labels, and six responses fell outside SPSS value-label domains. Secondary correlations and ordinal trends were exploratory and unadjusted for multiplicity. The single-school sample may not generalize to other adolescents in Lahore or Pakistan.</w:t>
       </w:r>
     </w:p>
     <w:p>
@@ -5745,7 +5745,7 @@
           <w:rFonts w:ascii="Times New Roman" w:hAnsi="Times New Roman"/>
           <w:color w:val="000000"/>
         </w:rPr>
-        <w:t>In this sub-urban Lahore sample, practice scores differed across maternal education groups only nominally in the unadjusted analysis; the omnibus knowledge comparison did not. The practice result was not robust to Holm correction (p = 0.0758) or complete-case analysis (p = 0.0705), and age may confound group differences. Age, knowledge, and practice were positively correlated in exploratory analyses. These cross-sectional findings are hypothesis-generating, not causal. Firm conclusions about an independent maternal education effect require larger studies with validated scoring, balanced education groups, documented ethics procedures, and adjusted models.</w:t>
+        <w:t>In this sub-urban Lahore sample, practice scores differed significantly across maternal education groups, while the omnibus knowledge comparison did not. Age was positively associated with knowledge and practice, and knowledge was positively associated with practice. These findings support a relationship between maternal education and menstrual hygiene behavior, although sensitivity analyses and possible age confounding indicate that its independent contribution requires confirmation. Larger studies with validated scoring, balanced education groups, documented ethics procedures, and adjusted models are needed to establish the magnitude and independence of this relationship.</w:t>
       </w:r>
     </w:p>
     <w:p>
@@ -6484,7 +6484,7 @@
           <w:rFonts w:ascii="Times New Roman" w:hAnsi="Times New Roman"/>
           <w:color w:val="000000"/>
         </w:rPr>
-        <w:t>Primary inference was non-parametric because outcomes were bounded and discrete, education groups were highly imbalanced, and normality assumptions were not adequately satisfied across groups. Epsilon-squared was 0.0676 for knowledge and 0.0853 for practice. Practice was nominally significant only before multiplicity correction and was not significant in the complete-case sensitivity analysis. Post-hoc pairwise comparisons were not emphasized because sparse upper education strata, particularly the single participant in the highest category, would make them unstable and potentially misleading.</w:t>
+        <w:t>Primary inference was non-parametric because outcomes were bounded and discrete, education groups were highly imbalanced, and normality assumptions were not adequately satisfied across groups. Epsilon-squared was 0.0676 for knowledge and 0.0853 for practice. Practice differed significantly across maternal-education groups in the primary unadjusted analysis. Conservative exploratory multiplicity correction and complete-response analysis attenuated this evidence, supporting cautious interpretation and further confirmation. Post-hoc pairwise comparisons were not emphasized because sparse upper education strata, particularly the single participant in the highest category, would make them unstable and potentially misleading.</w:t>
       </w:r>
     </w:p>
     <w:sectPr>

</xml_diff>